<commit_message>
SQL updation and dsa exercise
</commit_message>
<xml_diff>
--- a/deepskilling/advanced_sql_server/Exercise_04_Stored_Procedures/exercise_data.docx
+++ b/deepskilling/advanced_sql_server/Exercise_04_Stored_Procedures/exercise_data.docx
@@ -3,16 +3,38 @@
 <w:document xmlns:wpc="http://schemas.microsoft.com/office/word/2010/wordprocessingCanvas" xmlns:cx="http://schemas.microsoft.com/office/drawing/2014/chartex" xmlns:cx1="http://schemas.microsoft.com/office/drawing/2015/9/8/chartex" xmlns:cx2="http://schemas.microsoft.com/office/drawing/2015/10/21/chartex" xmlns:cx3="http://schemas.microsoft.com/office/drawing/2016/5/9/chartex" xmlns:cx4="http://schemas.microsoft.com/office/drawing/2016/5/10/chartex" xmlns:cx5="http://schemas.microsoft.com/office/drawing/2016/5/11/chartex" xmlns:cx6="http://schemas.microsoft.com/office/drawing/2016/5/12/chartex" xmlns:cx7="http://schemas.microsoft.com/office/drawing/2016/5/13/chartex" xmlns:cx8="http://schemas.microsoft.com/office/drawing/2016/5/14/chartex" xmlns:mc="http://schemas.openxmlformats.org/markup-compatibility/2006" xmlns:aink="http://schemas.microsoft.com/office/drawing/2016/ink" xmlns:am3d="http://schemas.microsoft.com/office/drawing/2017/model3d" xmlns:o="urn:schemas-microsoft-com:office:office" xmlns:r="http://schemas.openxmlformats.org/officeDocument/2006/relationships" xmlns:m="http://schemas.openxmlformats.org/officeDocument/2006/math" xmlns:v="urn:schemas-microsoft-com:vml" xmlns:wp14="http://schemas.microsoft.com/office/word/2010/wordprocessingDrawing" xmlns:wp="http://schemas.openxmlformats.org/drawingml/2006/wordprocessingDrawing" xmlns:w10="urn:schemas-microsoft-com:office:word" xmlns:w="http://schemas.openxmlformats.org/wordprocessingml/2006/main" xmlns:w14="http://schemas.microsoft.com/office/word/2010/wordml" xmlns:w15="http://schemas.microsoft.com/office/word/2012/wordml" xmlns:w16cex="http://schemas.microsoft.com/office/word/2018/wordml/cex" xmlns:w16cid="http://schemas.microsoft.com/office/word/2016/wordml/cid" xmlns:w16="http://schemas.microsoft.com/office/word/2018/wordml" xmlns:w16sdtdh="http://schemas.microsoft.com/office/word/2020/wordml/sdtdatahash" xmlns:w16se="http://schemas.microsoft.com/office/word/2015/wordml/symex" xmlns:wpg="http://schemas.microsoft.com/office/word/2010/wordprocessingGroup" xmlns:wpi="http://schemas.microsoft.com/office/word/2010/wordprocessingInk" xmlns:wne="http://schemas.microsoft.com/office/word/2006/wordml" xmlns:wps="http://schemas.microsoft.com/office/word/2010/wordprocessingShape" mc:Ignorable="w14 w15 w16se w16cid w16 w16cex w16sdtdh wp14">
   <w:body>
     <w:p>
-      <w:r>
-        <w:t>setup :</w:t>
+      <w:pPr>
+        <w:jc w:val="center"/>
+        <w:rPr>
+          <w:b/>
+          <w:bCs/>
+          <w:sz w:val="28"/>
+          <w:szCs w:val="28"/>
+        </w:rPr>
+      </w:pPr>
+      <w:r>
+        <w:rPr>
+          <w:b/>
+          <w:bCs/>
+          <w:sz w:val="28"/>
+          <w:szCs w:val="28"/>
+        </w:rPr>
+        <w:t>Stored Procedure</w:t>
       </w:r>
     </w:p>
     <w:p>
+      <w:proofErr w:type="gramStart"/>
+      <w:r>
+        <w:t>setup :</w:t>
+      </w:r>
+      <w:proofErr w:type="gramEnd"/>
+    </w:p>
+    <w:p>
       <w:r>
         <w:drawing>
-          <wp:inline distT="0" distB="0" distL="0" distR="0" wp14:anchorId="55C8C12C" wp14:editId="2DADE449">
-            <wp:extent cx="5731510" cy="4720590"/>
-            <wp:effectExtent l="0" t="0" r="2540" b="3810"/>
+          <wp:inline distT="0" distB="0" distL="0" distR="0" wp14:anchorId="103BE8B4" wp14:editId="655AEBCD">
+            <wp:extent cx="5654530" cy="4557155"/>
+            <wp:effectExtent l="0" t="0" r="3810" b="0"/>
             <wp:docPr id="1" name="Picture 1"/>
             <wp:cNvGraphicFramePr>
               <a:graphicFrameLocks xmlns:a="http://schemas.openxmlformats.org/drawingml/2006/main" noChangeAspect="1"/>
@@ -33,7 +55,7 @@
                   <pic:spPr>
                     <a:xfrm>
                       <a:off x="0" y="0"/>
-                      <a:ext cx="5731510" cy="4720590"/>
+                      <a:ext cx="5654530" cy="4557155"/>
                     </a:xfrm>
                     <a:prstGeom prst="rect">
                       <a:avLst/>
@@ -48,16 +70,21 @@
     </w:p>
     <w:p>
       <w:r>
-        <w:t>01_create_procedure :</w:t>
-      </w:r>
+        <w:t>01_create_</w:t>
+      </w:r>
+      <w:proofErr w:type="gramStart"/>
+      <w:r>
+        <w:t>procedure :</w:t>
+      </w:r>
+      <w:proofErr w:type="gramEnd"/>
     </w:p>
     <w:p>
       <w:r>
         <w:drawing>
-          <wp:inline distT="0" distB="0" distL="0" distR="0" wp14:anchorId="68204D15" wp14:editId="7A32A2E1">
-            <wp:extent cx="5731257" cy="3443288"/>
-            <wp:effectExtent l="0" t="0" r="3175" b="5080"/>
-            <wp:docPr id="2" name="Picture 2"/>
+          <wp:inline distT="0" distB="0" distL="0" distR="0" wp14:anchorId="74C24905" wp14:editId="3E497561">
+            <wp:extent cx="5731510" cy="3030855"/>
+            <wp:effectExtent l="0" t="0" r="2540" b="0"/>
+            <wp:docPr id="13" name="Picture 13"/>
             <wp:cNvGraphicFramePr>
               <a:graphicFrameLocks xmlns:a="http://schemas.openxmlformats.org/drawingml/2006/main" noChangeAspect="1"/>
             </wp:cNvGraphicFramePr>
@@ -77,7 +104,7 @@
                   <pic:spPr>
                     <a:xfrm>
                       <a:off x="0" y="0"/>
-                      <a:ext cx="5735151" cy="3445627"/>
+                      <a:ext cx="5731510" cy="3030855"/>
                     </a:xfrm>
                     <a:prstGeom prst="rect">
                       <a:avLst/>
@@ -90,19 +117,26 @@
         </w:drawing>
       </w:r>
     </w:p>
+    <w:p/>
+    <w:p/>
+    <w:p/>
     <w:p>
       <w:r>
-        <w:lastRenderedPageBreak/>
-        <w:t>02_modify_procedure :</w:t>
-      </w:r>
+        <w:t>04_execute_</w:t>
+      </w:r>
+      <w:proofErr w:type="gramStart"/>
+      <w:r>
+        <w:t>procedure :</w:t>
+      </w:r>
+      <w:proofErr w:type="gramEnd"/>
     </w:p>
     <w:p>
       <w:r>
         <w:drawing>
-          <wp:inline distT="0" distB="0" distL="0" distR="0" wp14:anchorId="2F7A7E41" wp14:editId="5DC53C90">
-            <wp:extent cx="5731510" cy="3651250"/>
-            <wp:effectExtent l="0" t="0" r="2540" b="6350"/>
-            <wp:docPr id="3" name="Picture 3"/>
+          <wp:inline distT="0" distB="0" distL="0" distR="0" wp14:anchorId="3C70A6A3" wp14:editId="01C6D363">
+            <wp:extent cx="5731510" cy="4001770"/>
+            <wp:effectExtent l="0" t="0" r="2540" b="0"/>
+            <wp:docPr id="20" name="Picture 20"/>
             <wp:cNvGraphicFramePr>
               <a:graphicFrameLocks xmlns:a="http://schemas.openxmlformats.org/drawingml/2006/main" noChangeAspect="1"/>
             </wp:cNvGraphicFramePr>
@@ -122,7 +156,7 @@
                   <pic:spPr>
                     <a:xfrm>
                       <a:off x="0" y="0"/>
-                      <a:ext cx="5731510" cy="3651250"/>
+                      <a:ext cx="5731510" cy="4001770"/>
                     </a:xfrm>
                     <a:prstGeom prst="rect">
                       <a:avLst/>
@@ -137,16 +171,22 @@
     </w:p>
     <w:p>
       <w:r>
-        <w:t>03_delete_procedure :</w:t>
-      </w:r>
+        <w:t>05_return_</w:t>
+      </w:r>
+      <w:proofErr w:type="gramStart"/>
+      <w:r>
+        <w:t>data :</w:t>
+      </w:r>
+      <w:proofErr w:type="gramEnd"/>
     </w:p>
     <w:p>
       <w:r>
+        <w:lastRenderedPageBreak/>
         <w:drawing>
-          <wp:inline distT="0" distB="0" distL="0" distR="0" wp14:anchorId="4F056300" wp14:editId="5622E421">
-            <wp:extent cx="5731510" cy="4017010"/>
-            <wp:effectExtent l="0" t="0" r="2540" b="2540"/>
-            <wp:docPr id="4" name="Picture 4"/>
+          <wp:inline distT="0" distB="0" distL="0" distR="0" wp14:anchorId="51200F70" wp14:editId="4D9742A6">
+            <wp:extent cx="5731510" cy="3848100"/>
+            <wp:effectExtent l="0" t="0" r="2540" b="0"/>
+            <wp:docPr id="21" name="Picture 21"/>
             <wp:cNvGraphicFramePr>
               <a:graphicFrameLocks xmlns:a="http://schemas.openxmlformats.org/drawingml/2006/main" noChangeAspect="1"/>
             </wp:cNvGraphicFramePr>
@@ -166,601 +206,7 @@
                   <pic:spPr>
                     <a:xfrm>
                       <a:off x="0" y="0"/>
-                      <a:ext cx="5731510" cy="4017010"/>
-                    </a:xfrm>
-                    <a:prstGeom prst="rect">
-                      <a:avLst/>
-                    </a:prstGeom>
-                  </pic:spPr>
-                </pic:pic>
-              </a:graphicData>
-            </a:graphic>
-          </wp:inline>
-        </w:drawing>
-      </w:r>
-    </w:p>
-    <w:p/>
-    <w:p>
-      <w:r>
-        <w:lastRenderedPageBreak/>
-        <w:t>04_execute_procedure :</w:t>
-      </w:r>
-    </w:p>
-    <w:p>
-      <w:r>
-        <w:drawing>
-          <wp:inline distT="0" distB="0" distL="0" distR="0" wp14:anchorId="7D29825E" wp14:editId="1C15D50A">
-            <wp:extent cx="5731510" cy="3788410"/>
-            <wp:effectExtent l="0" t="0" r="2540" b="2540"/>
-            <wp:docPr id="5" name="Picture 5"/>
-            <wp:cNvGraphicFramePr>
-              <a:graphicFrameLocks xmlns:a="http://schemas.openxmlformats.org/drawingml/2006/main" noChangeAspect="1"/>
-            </wp:cNvGraphicFramePr>
-            <a:graphic xmlns:a="http://schemas.openxmlformats.org/drawingml/2006/main">
-              <a:graphicData uri="http://schemas.openxmlformats.org/drawingml/2006/picture">
-                <pic:pic xmlns:pic="http://schemas.openxmlformats.org/drawingml/2006/picture">
-                  <pic:nvPicPr>
-                    <pic:cNvPr id="1" name=""/>
-                    <pic:cNvPicPr/>
-                  </pic:nvPicPr>
-                  <pic:blipFill>
-                    <a:blip r:embed="rId8"/>
-                    <a:stretch>
-                      <a:fillRect/>
-                    </a:stretch>
-                  </pic:blipFill>
-                  <pic:spPr>
-                    <a:xfrm>
-                      <a:off x="0" y="0"/>
-                      <a:ext cx="5731510" cy="3788410"/>
-                    </a:xfrm>
-                    <a:prstGeom prst="rect">
-                      <a:avLst/>
-                    </a:prstGeom>
-                  </pic:spPr>
-                </pic:pic>
-              </a:graphicData>
-            </a:graphic>
-          </wp:inline>
-        </w:drawing>
-      </w:r>
-    </w:p>
-    <w:p>
-      <w:r>
-        <w:t>05_return_data :</w:t>
-      </w:r>
-    </w:p>
-    <w:p>
-      <w:r>
-        <w:drawing>
-          <wp:inline distT="0" distB="0" distL="0" distR="0" wp14:anchorId="2273ED71" wp14:editId="45325D50">
-            <wp:extent cx="5731510" cy="3961765"/>
-            <wp:effectExtent l="0" t="0" r="2540" b="635"/>
-            <wp:docPr id="6" name="Picture 6"/>
-            <wp:cNvGraphicFramePr>
-              <a:graphicFrameLocks xmlns:a="http://schemas.openxmlformats.org/drawingml/2006/main" noChangeAspect="1"/>
-            </wp:cNvGraphicFramePr>
-            <a:graphic xmlns:a="http://schemas.openxmlformats.org/drawingml/2006/main">
-              <a:graphicData uri="http://schemas.openxmlformats.org/drawingml/2006/picture">
-                <pic:pic xmlns:pic="http://schemas.openxmlformats.org/drawingml/2006/picture">
-                  <pic:nvPicPr>
-                    <pic:cNvPr id="1" name=""/>
-                    <pic:cNvPicPr/>
-                  </pic:nvPicPr>
-                  <pic:blipFill>
-                    <a:blip r:embed="rId9"/>
-                    <a:stretch>
-                      <a:fillRect/>
-                    </a:stretch>
-                  </pic:blipFill>
-                  <pic:spPr>
-                    <a:xfrm>
-                      <a:off x="0" y="0"/>
-                      <a:ext cx="5731510" cy="3961765"/>
-                    </a:xfrm>
-                    <a:prstGeom prst="rect">
-                      <a:avLst/>
-                    </a:prstGeom>
-                  </pic:spPr>
-                </pic:pic>
-              </a:graphicData>
-            </a:graphic>
-          </wp:inline>
-        </w:drawing>
-      </w:r>
-    </w:p>
-    <w:p>
-      <w:r>
-        <w:lastRenderedPageBreak/>
-        <w:drawing>
-          <wp:inline distT="0" distB="0" distL="0" distR="0" wp14:anchorId="61888CB8" wp14:editId="4E8B6C20">
-            <wp:extent cx="4023709" cy="4160881"/>
-            <wp:effectExtent l="0" t="0" r="0" b="0"/>
-            <wp:docPr id="7" name="Picture 7"/>
-            <wp:cNvGraphicFramePr>
-              <a:graphicFrameLocks xmlns:a="http://schemas.openxmlformats.org/drawingml/2006/main" noChangeAspect="1"/>
-            </wp:cNvGraphicFramePr>
-            <a:graphic xmlns:a="http://schemas.openxmlformats.org/drawingml/2006/main">
-              <a:graphicData uri="http://schemas.openxmlformats.org/drawingml/2006/picture">
-                <pic:pic xmlns:pic="http://schemas.openxmlformats.org/drawingml/2006/picture">
-                  <pic:nvPicPr>
-                    <pic:cNvPr id="1" name=""/>
-                    <pic:cNvPicPr/>
-                  </pic:nvPicPr>
-                  <pic:blipFill>
-                    <a:blip r:embed="rId10"/>
-                    <a:stretch>
-                      <a:fillRect/>
-                    </a:stretch>
-                  </pic:blipFill>
-                  <pic:spPr>
-                    <a:xfrm>
-                      <a:off x="0" y="0"/>
-                      <a:ext cx="4023709" cy="4160881"/>
-                    </a:xfrm>
-                    <a:prstGeom prst="rect">
-                      <a:avLst/>
-                    </a:prstGeom>
-                  </pic:spPr>
-                </pic:pic>
-              </a:graphicData>
-            </a:graphic>
-          </wp:inline>
-        </w:drawing>
-      </w:r>
-    </w:p>
-    <w:p>
-      <w:r>
-        <w:t>06_output_parameter :</w:t>
-      </w:r>
-    </w:p>
-    <w:p>
-      <w:r>
-        <w:drawing>
-          <wp:inline distT="0" distB="0" distL="0" distR="0" wp14:anchorId="3FD70C37" wp14:editId="34424B67">
-            <wp:extent cx="5731510" cy="4185920"/>
-            <wp:effectExtent l="0" t="0" r="2540" b="5080"/>
-            <wp:docPr id="8" name="Picture 8"/>
-            <wp:cNvGraphicFramePr>
-              <a:graphicFrameLocks xmlns:a="http://schemas.openxmlformats.org/drawingml/2006/main" noChangeAspect="1"/>
-            </wp:cNvGraphicFramePr>
-            <a:graphic xmlns:a="http://schemas.openxmlformats.org/drawingml/2006/main">
-              <a:graphicData uri="http://schemas.openxmlformats.org/drawingml/2006/picture">
-                <pic:pic xmlns:pic="http://schemas.openxmlformats.org/drawingml/2006/picture">
-                  <pic:nvPicPr>
-                    <pic:cNvPr id="1" name=""/>
-                    <pic:cNvPicPr/>
-                  </pic:nvPicPr>
-                  <pic:blipFill>
-                    <a:blip r:embed="rId11"/>
-                    <a:stretch>
-                      <a:fillRect/>
-                    </a:stretch>
-                  </pic:blipFill>
-                  <pic:spPr>
-                    <a:xfrm>
-                      <a:off x="0" y="0"/>
-                      <a:ext cx="5731510" cy="4185920"/>
-                    </a:xfrm>
-                    <a:prstGeom prst="rect">
-                      <a:avLst/>
-                    </a:prstGeom>
-                  </pic:spPr>
-                </pic:pic>
-              </a:graphicData>
-            </a:graphic>
-          </wp:inline>
-        </w:drawing>
-      </w:r>
-    </w:p>
-    <w:p>
-      <w:r>
-        <w:lastRenderedPageBreak/>
-        <w:drawing>
-          <wp:inline distT="0" distB="0" distL="0" distR="0" wp14:anchorId="06993DB1" wp14:editId="3FE05C2F">
-            <wp:extent cx="4038950" cy="4389500"/>
-            <wp:effectExtent l="0" t="0" r="0" b="0"/>
-            <wp:docPr id="9" name="Picture 9"/>
-            <wp:cNvGraphicFramePr>
-              <a:graphicFrameLocks xmlns:a="http://schemas.openxmlformats.org/drawingml/2006/main" noChangeAspect="1"/>
-            </wp:cNvGraphicFramePr>
-            <a:graphic xmlns:a="http://schemas.openxmlformats.org/drawingml/2006/main">
-              <a:graphicData uri="http://schemas.openxmlformats.org/drawingml/2006/picture">
-                <pic:pic xmlns:pic="http://schemas.openxmlformats.org/drawingml/2006/picture">
-                  <pic:nvPicPr>
-                    <pic:cNvPr id="1" name=""/>
-                    <pic:cNvPicPr/>
-                  </pic:nvPicPr>
-                  <pic:blipFill>
-                    <a:blip r:embed="rId12"/>
-                    <a:stretch>
-                      <a:fillRect/>
-                    </a:stretch>
-                  </pic:blipFill>
-                  <pic:spPr>
-                    <a:xfrm>
-                      <a:off x="0" y="0"/>
-                      <a:ext cx="4038950" cy="4389500"/>
-                    </a:xfrm>
-                    <a:prstGeom prst="rect">
-                      <a:avLst/>
-                    </a:prstGeom>
-                  </pic:spPr>
-                </pic:pic>
-              </a:graphicData>
-            </a:graphic>
-          </wp:inline>
-        </w:drawing>
-      </w:r>
-    </w:p>
-    <w:p>
-      <w:r>
-        <w:t>07_update_salary :</w:t>
-      </w:r>
-    </w:p>
-    <w:p>
-      <w:r>
-        <w:drawing>
-          <wp:inline distT="0" distB="0" distL="0" distR="0" wp14:anchorId="195E4723" wp14:editId="7E69EFEA">
-            <wp:extent cx="5731510" cy="3888740"/>
-            <wp:effectExtent l="0" t="0" r="2540" b="0"/>
-            <wp:docPr id="10" name="Picture 10"/>
-            <wp:cNvGraphicFramePr>
-              <a:graphicFrameLocks xmlns:a="http://schemas.openxmlformats.org/drawingml/2006/main" noChangeAspect="1"/>
-            </wp:cNvGraphicFramePr>
-            <a:graphic xmlns:a="http://schemas.openxmlformats.org/drawingml/2006/main">
-              <a:graphicData uri="http://schemas.openxmlformats.org/drawingml/2006/picture">
-                <pic:pic xmlns:pic="http://schemas.openxmlformats.org/drawingml/2006/picture">
-                  <pic:nvPicPr>
-                    <pic:cNvPr id="1" name=""/>
-                    <pic:cNvPicPr/>
-                  </pic:nvPicPr>
-                  <pic:blipFill>
-                    <a:blip r:embed="rId13"/>
-                    <a:stretch>
-                      <a:fillRect/>
-                    </a:stretch>
-                  </pic:blipFill>
-                  <pic:spPr>
-                    <a:xfrm>
-                      <a:off x="0" y="0"/>
-                      <a:ext cx="5731510" cy="3888740"/>
-                    </a:xfrm>
-                    <a:prstGeom prst="rect">
-                      <a:avLst/>
-                    </a:prstGeom>
-                  </pic:spPr>
-                </pic:pic>
-              </a:graphicData>
-            </a:graphic>
-          </wp:inline>
-        </w:drawing>
-      </w:r>
-    </w:p>
-    <w:p>
-      <w:r>
-        <w:lastRenderedPageBreak/>
-        <w:drawing>
-          <wp:inline distT="0" distB="0" distL="0" distR="0" wp14:anchorId="52592A86" wp14:editId="41C1376A">
-            <wp:extent cx="5395428" cy="4694327"/>
-            <wp:effectExtent l="0" t="0" r="0" b="0"/>
-            <wp:docPr id="11" name="Picture 11"/>
-            <wp:cNvGraphicFramePr>
-              <a:graphicFrameLocks xmlns:a="http://schemas.openxmlformats.org/drawingml/2006/main" noChangeAspect="1"/>
-            </wp:cNvGraphicFramePr>
-            <a:graphic xmlns:a="http://schemas.openxmlformats.org/drawingml/2006/main">
-              <a:graphicData uri="http://schemas.openxmlformats.org/drawingml/2006/picture">
-                <pic:pic xmlns:pic="http://schemas.openxmlformats.org/drawingml/2006/picture">
-                  <pic:nvPicPr>
-                    <pic:cNvPr id="1" name=""/>
-                    <pic:cNvPicPr/>
-                  </pic:nvPicPr>
-                  <pic:blipFill>
-                    <a:blip r:embed="rId14"/>
-                    <a:stretch>
-                      <a:fillRect/>
-                    </a:stretch>
-                  </pic:blipFill>
-                  <pic:spPr>
-                    <a:xfrm>
-                      <a:off x="0" y="0"/>
-                      <a:ext cx="5395428" cy="4694327"/>
-                    </a:xfrm>
-                    <a:prstGeom prst="rect">
-                      <a:avLst/>
-                    </a:prstGeom>
-                  </pic:spPr>
-                </pic:pic>
-              </a:graphicData>
-            </a:graphic>
-          </wp:inline>
-        </w:drawing>
-      </w:r>
-    </w:p>
-    <w:p>
-      <w:r>
-        <w:t>08_give_bonus :</w:t>
-      </w:r>
-    </w:p>
-    <w:p>
-      <w:r>
-        <w:drawing>
-          <wp:inline distT="0" distB="0" distL="0" distR="0" wp14:anchorId="650719BF" wp14:editId="4B966416">
-            <wp:extent cx="5698490" cy="3650456"/>
-            <wp:effectExtent l="0" t="0" r="0" b="7620"/>
-            <wp:docPr id="12" name="Picture 12"/>
-            <wp:cNvGraphicFramePr>
-              <a:graphicFrameLocks xmlns:a="http://schemas.openxmlformats.org/drawingml/2006/main" noChangeAspect="1"/>
-            </wp:cNvGraphicFramePr>
-            <a:graphic xmlns:a="http://schemas.openxmlformats.org/drawingml/2006/main">
-              <a:graphicData uri="http://schemas.openxmlformats.org/drawingml/2006/picture">
-                <pic:pic xmlns:pic="http://schemas.openxmlformats.org/drawingml/2006/picture">
-                  <pic:nvPicPr>
-                    <pic:cNvPr id="1" name=""/>
-                    <pic:cNvPicPr/>
-                  </pic:nvPicPr>
-                  <pic:blipFill>
-                    <a:blip r:embed="rId15"/>
-                    <a:stretch>
-                      <a:fillRect/>
-                    </a:stretch>
-                  </pic:blipFill>
-                  <pic:spPr>
-                    <a:xfrm>
-                      <a:off x="0" y="0"/>
-                      <a:ext cx="5708546" cy="3656898"/>
-                    </a:xfrm>
-                    <a:prstGeom prst="rect">
-                      <a:avLst/>
-                    </a:prstGeom>
-                  </pic:spPr>
-                </pic:pic>
-              </a:graphicData>
-            </a:graphic>
-          </wp:inline>
-        </w:drawing>
-      </w:r>
-    </w:p>
-    <w:p>
-      <w:r>
-        <w:lastRenderedPageBreak/>
-        <w:drawing>
-          <wp:inline distT="0" distB="0" distL="0" distR="0" wp14:anchorId="167A39F8" wp14:editId="6A0E8BAD">
-            <wp:extent cx="5524979" cy="4549534"/>
-            <wp:effectExtent l="0" t="0" r="0" b="3810"/>
-            <wp:docPr id="14" name="Picture 14"/>
-            <wp:cNvGraphicFramePr>
-              <a:graphicFrameLocks xmlns:a="http://schemas.openxmlformats.org/drawingml/2006/main" noChangeAspect="1"/>
-            </wp:cNvGraphicFramePr>
-            <a:graphic xmlns:a="http://schemas.openxmlformats.org/drawingml/2006/main">
-              <a:graphicData uri="http://schemas.openxmlformats.org/drawingml/2006/picture">
-                <pic:pic xmlns:pic="http://schemas.openxmlformats.org/drawingml/2006/picture">
-                  <pic:nvPicPr>
-                    <pic:cNvPr id="1" name=""/>
-                    <pic:cNvPicPr/>
-                  </pic:nvPicPr>
-                  <pic:blipFill>
-                    <a:blip r:embed="rId16"/>
-                    <a:stretch>
-                      <a:fillRect/>
-                    </a:stretch>
-                  </pic:blipFill>
-                  <pic:spPr>
-                    <a:xfrm>
-                      <a:off x="0" y="0"/>
-                      <a:ext cx="5524979" cy="4549534"/>
-                    </a:xfrm>
-                    <a:prstGeom prst="rect">
-                      <a:avLst/>
-                    </a:prstGeom>
-                  </pic:spPr>
-                </pic:pic>
-              </a:graphicData>
-            </a:graphic>
-          </wp:inline>
-        </w:drawing>
-      </w:r>
-    </w:p>
-    <w:p>
-      <w:r>
-        <w:t>09_transaction :</w:t>
-      </w:r>
-    </w:p>
-    <w:p>
-      <w:r>
-        <w:drawing>
-          <wp:inline distT="0" distB="0" distL="0" distR="0" wp14:anchorId="6591E444" wp14:editId="359F41A6">
-            <wp:extent cx="5731510" cy="3843338"/>
-            <wp:effectExtent l="0" t="0" r="2540" b="5080"/>
-            <wp:docPr id="15" name="Picture 15"/>
-            <wp:cNvGraphicFramePr>
-              <a:graphicFrameLocks xmlns:a="http://schemas.openxmlformats.org/drawingml/2006/main" noChangeAspect="1"/>
-            </wp:cNvGraphicFramePr>
-            <a:graphic xmlns:a="http://schemas.openxmlformats.org/drawingml/2006/main">
-              <a:graphicData uri="http://schemas.openxmlformats.org/drawingml/2006/picture">
-                <pic:pic xmlns:pic="http://schemas.openxmlformats.org/drawingml/2006/picture">
-                  <pic:nvPicPr>
-                    <pic:cNvPr id="1" name=""/>
-                    <pic:cNvPicPr/>
-                  </pic:nvPicPr>
-                  <pic:blipFill>
-                    <a:blip r:embed="rId17"/>
-                    <a:stretch>
-                      <a:fillRect/>
-                    </a:stretch>
-                  </pic:blipFill>
-                  <pic:spPr>
-                    <a:xfrm>
-                      <a:off x="0" y="0"/>
-                      <a:ext cx="5734963" cy="3845653"/>
-                    </a:xfrm>
-                    <a:prstGeom prst="rect">
-                      <a:avLst/>
-                    </a:prstGeom>
-                  </pic:spPr>
-                </pic:pic>
-              </a:graphicData>
-            </a:graphic>
-          </wp:inline>
-        </w:drawing>
-      </w:r>
-    </w:p>
-    <w:p>
-      <w:r>
-        <w:lastRenderedPageBreak/>
-        <w:drawing>
-          <wp:inline distT="0" distB="0" distL="0" distR="0" wp14:anchorId="6194063D" wp14:editId="6C948F90">
-            <wp:extent cx="5731510" cy="4514850"/>
-            <wp:effectExtent l="0" t="0" r="2540" b="0"/>
-            <wp:docPr id="16" name="Picture 16"/>
-            <wp:cNvGraphicFramePr>
-              <a:graphicFrameLocks xmlns:a="http://schemas.openxmlformats.org/drawingml/2006/main" noChangeAspect="1"/>
-            </wp:cNvGraphicFramePr>
-            <a:graphic xmlns:a="http://schemas.openxmlformats.org/drawingml/2006/main">
-              <a:graphicData uri="http://schemas.openxmlformats.org/drawingml/2006/picture">
-                <pic:pic xmlns:pic="http://schemas.openxmlformats.org/drawingml/2006/picture">
-                  <pic:nvPicPr>
-                    <pic:cNvPr id="1" name=""/>
-                    <pic:cNvPicPr/>
-                  </pic:nvPicPr>
-                  <pic:blipFill>
-                    <a:blip r:embed="rId18"/>
-                    <a:stretch>
-                      <a:fillRect/>
-                    </a:stretch>
-                  </pic:blipFill>
-                  <pic:spPr>
-                    <a:xfrm>
-                      <a:off x="0" y="0"/>
-                      <a:ext cx="5731510" cy="4514850"/>
-                    </a:xfrm>
-                    <a:prstGeom prst="rect">
-                      <a:avLst/>
-                    </a:prstGeom>
-                  </pic:spPr>
-                </pic:pic>
-              </a:graphicData>
-            </a:graphic>
-          </wp:inline>
-        </w:drawing>
-      </w:r>
-    </w:p>
-    <w:p>
-      <w:r>
-        <w:t>10_dynamic_sql :</w:t>
-      </w:r>
-    </w:p>
-    <w:p>
-      <w:r>
-        <w:drawing>
-          <wp:inline distT="0" distB="0" distL="0" distR="0" wp14:anchorId="3BF7CE51" wp14:editId="54EF38A7">
-            <wp:extent cx="5455920" cy="3779044"/>
-            <wp:effectExtent l="0" t="0" r="0" b="0"/>
-            <wp:docPr id="17" name="Picture 17"/>
-            <wp:cNvGraphicFramePr>
-              <a:graphicFrameLocks xmlns:a="http://schemas.openxmlformats.org/drawingml/2006/main" noChangeAspect="1"/>
-            </wp:cNvGraphicFramePr>
-            <a:graphic xmlns:a="http://schemas.openxmlformats.org/drawingml/2006/main">
-              <a:graphicData uri="http://schemas.openxmlformats.org/drawingml/2006/picture">
-                <pic:pic xmlns:pic="http://schemas.openxmlformats.org/drawingml/2006/picture">
-                  <pic:nvPicPr>
-                    <pic:cNvPr id="1" name=""/>
-                    <pic:cNvPicPr/>
-                  </pic:nvPicPr>
-                  <pic:blipFill>
-                    <a:blip r:embed="rId19"/>
-                    <a:stretch>
-                      <a:fillRect/>
-                    </a:stretch>
-                  </pic:blipFill>
-                  <pic:spPr>
-                    <a:xfrm>
-                      <a:off x="0" y="0"/>
-                      <a:ext cx="5458653" cy="3780937"/>
-                    </a:xfrm>
-                    <a:prstGeom prst="rect">
-                      <a:avLst/>
-                    </a:prstGeom>
-                  </pic:spPr>
-                </pic:pic>
-              </a:graphicData>
-            </a:graphic>
-          </wp:inline>
-        </w:drawing>
-      </w:r>
-    </w:p>
-    <w:p>
-      <w:r>
-        <w:lastRenderedPageBreak/>
-        <w:t>11_error_handling :</w:t>
-      </w:r>
-    </w:p>
-    <w:p>
-      <w:r>
-        <w:drawing>
-          <wp:inline distT="0" distB="0" distL="0" distR="0" wp14:anchorId="502CB9A2" wp14:editId="3613600B">
-            <wp:extent cx="5731510" cy="4448810"/>
-            <wp:effectExtent l="0" t="0" r="2540" b="8890"/>
-            <wp:docPr id="18" name="Picture 18"/>
-            <wp:cNvGraphicFramePr>
-              <a:graphicFrameLocks xmlns:a="http://schemas.openxmlformats.org/drawingml/2006/main" noChangeAspect="1"/>
-            </wp:cNvGraphicFramePr>
-            <a:graphic xmlns:a="http://schemas.openxmlformats.org/drawingml/2006/main">
-              <a:graphicData uri="http://schemas.openxmlformats.org/drawingml/2006/picture">
-                <pic:pic xmlns:pic="http://schemas.openxmlformats.org/drawingml/2006/picture">
-                  <pic:nvPicPr>
-                    <pic:cNvPr id="1" name=""/>
-                    <pic:cNvPicPr/>
-                  </pic:nvPicPr>
-                  <pic:blipFill>
-                    <a:blip r:embed="rId20"/>
-                    <a:stretch>
-                      <a:fillRect/>
-                    </a:stretch>
-                  </pic:blipFill>
-                  <pic:spPr>
-                    <a:xfrm>
-                      <a:off x="0" y="0"/>
-                      <a:ext cx="5731510" cy="4448810"/>
-                    </a:xfrm>
-                    <a:prstGeom prst="rect">
-                      <a:avLst/>
-                    </a:prstGeom>
-                  </pic:spPr>
-                </pic:pic>
-              </a:graphicData>
-            </a:graphic>
-          </wp:inline>
-        </w:drawing>
-      </w:r>
-    </w:p>
-    <w:p>
-      <w:r>
-        <w:drawing>
-          <wp:inline distT="0" distB="0" distL="0" distR="0" wp14:anchorId="5F94466D" wp14:editId="22FCE637">
-            <wp:extent cx="5730842" cy="3693319"/>
-            <wp:effectExtent l="0" t="0" r="3810" b="2540"/>
-            <wp:docPr id="19" name="Picture 19"/>
-            <wp:cNvGraphicFramePr>
-              <a:graphicFrameLocks xmlns:a="http://schemas.openxmlformats.org/drawingml/2006/main" noChangeAspect="1"/>
-            </wp:cNvGraphicFramePr>
-            <a:graphic xmlns:a="http://schemas.openxmlformats.org/drawingml/2006/main">
-              <a:graphicData uri="http://schemas.openxmlformats.org/drawingml/2006/picture">
-                <pic:pic xmlns:pic="http://schemas.openxmlformats.org/drawingml/2006/picture">
-                  <pic:nvPicPr>
-                    <pic:cNvPr id="1" name=""/>
-                    <pic:cNvPicPr/>
-                  </pic:nvPicPr>
-                  <pic:blipFill>
-                    <a:blip r:embed="rId21"/>
-                    <a:stretch>
-                      <a:fillRect/>
-                    </a:stretch>
-                  </pic:blipFill>
-                  <pic:spPr>
-                    <a:xfrm>
-                      <a:off x="0" y="0"/>
-                      <a:ext cx="5736891" cy="3697217"/>
+                      <a:ext cx="5731510" cy="3848100"/>
                     </a:xfrm>
                     <a:prstGeom prst="rect">
                       <a:avLst/>

</xml_diff>